<commit_message>
dialect contact questionnaire comments
added comments to dialect contact questionnaire
</commit_message>
<xml_diff>
--- a/irb/questionnaires/sociodemographic/pt_in_new_socio_questionnaire.docx
+++ b/irb/questionnaires/sociodemographic/pt_in_new_socio_questionnaire.docx
@@ -192,6 +192,7 @@
           <w:lang w:val="pt-BR"/>
         </w:rPr>
       </w:pPr>
+      <w:commentRangeStart w:id="0"/>
       <w:r>
         <w:rPr>
           <w:b/>
@@ -200,7 +201,31 @@
           <w:color w:val="CC0033"/>
           <w:lang w:val="pt-BR"/>
         </w:rPr>
-        <w:t>Questionário sociodemográfico</w:t>
+        <w:t xml:space="preserve">Questionário </w:t>
+      </w:r>
+      <w:commentRangeEnd w:id="0"/>
+      <w:r>
+        <w:rPr>
+          <w:rStyle w:val="CommentReference"/>
+          <w:b/>
+          <w:bCs/>
+          <w:smallCaps/>
+          <w:color w:val="CC0033"/>
+          <w:sz w:val="24"/>
+          <w:szCs w:val="24"/>
+          <w:lang w:val="pt-BR"/>
+        </w:rPr>
+        <w:commentReference w:id="0"/>
+      </w:r>
+      <w:r>
+        <w:rPr>
+          <w:b/>
+          <w:bCs/>
+          <w:smallCaps/>
+          <w:color w:val="CC0033"/>
+          <w:lang w:val="pt-BR"/>
+        </w:rPr>
+        <w:t>sociodemográfico</w:t>
       </w:r>
     </w:p>
     <w:p>
@@ -216,7 +241,7 @@
           <w:lang w:val="pt-BR"/>
         </w:rPr>
       </w:pPr>
-      <w:commentRangeStart w:id="0"/>
+      <w:commentRangeStart w:id="1"/>
       <w:r>
         <w:rPr>
           <w:rFonts w:ascii="Palatino Linotype" w:hAnsi="Palatino Linotype"/>
@@ -229,7 +254,7 @@
         </w:rPr>
         <w:t>A. Informação demográfica</w:t>
       </w:r>
-      <w:commentRangeEnd w:id="0"/>
+      <w:commentRangeEnd w:id="1"/>
       <w:r>
         <w:rPr>
           <w:rStyle w:val="CommentReference"/>
@@ -241,7 +266,7 @@
           <w:szCs w:val="20"/>
           <w:lang w:val="pt-BR"/>
         </w:rPr>
-        <w:commentReference w:id="0"/>
+        <w:commentReference w:id="1"/>
       </w:r>
     </w:p>
     <w:p>
@@ -331,7 +356,37 @@
           <w:szCs w:val="20"/>
           <w:lang w:val="pt-BR"/>
         </w:rPr>
-        <w:t>Qual é o seu lugar de origem? Se nasceu nos Estados Unidos, qual é a origem da sua família?</w:t>
+        <w:t xml:space="preserve">Qual é o seu lugar de origem? Se nasceu nos Estados Unidos, qual é a origem da sua </w:t>
+      </w:r>
+      <w:commentRangeStart w:id="2"/>
+      <w:r>
+        <w:rPr>
+          <w:rFonts w:ascii="Palatino Linotype" w:hAnsi="Palatino Linotype"/>
+          <w:sz w:val="20"/>
+          <w:szCs w:val="20"/>
+          <w:lang w:val="pt-BR"/>
+        </w:rPr>
+        <w:t>família</w:t>
+      </w:r>
+      <w:commentRangeEnd w:id="2"/>
+      <w:r>
+        <w:rPr>
+          <w:rStyle w:val="CommentReference"/>
+          <w:rFonts w:ascii="Palatino Linotype" w:hAnsi="Palatino Linotype"/>
+          <w:sz w:val="20"/>
+          <w:szCs w:val="20"/>
+          <w:lang w:val="pt-BR"/>
+        </w:rPr>
+        <w:commentReference w:id="2"/>
+      </w:r>
+      <w:r>
+        <w:rPr>
+          <w:rFonts w:ascii="Palatino Linotype" w:hAnsi="Palatino Linotype"/>
+          <w:sz w:val="20"/>
+          <w:szCs w:val="20"/>
+          <w:lang w:val="pt-BR"/>
+        </w:rPr>
+        <w:t>?</w:t>
       </w:r>
       <w:r>
         <w:rPr>
@@ -463,7 +518,37 @@
           <w:szCs w:val="20"/>
           <w:lang w:val="pt-BR"/>
         </w:rPr>
-        <w:t xml:space="preserve"> você estudou?</w:t>
+        <w:t xml:space="preserve"> você </w:t>
+      </w:r>
+      <w:commentRangeStart w:id="3"/>
+      <w:r>
+        <w:rPr>
+          <w:rFonts w:ascii="Palatino Linotype" w:hAnsi="Palatino Linotype"/>
+          <w:sz w:val="20"/>
+          <w:szCs w:val="20"/>
+          <w:lang w:val="pt-BR"/>
+        </w:rPr>
+        <w:t>estudou</w:t>
+      </w:r>
+      <w:commentRangeEnd w:id="3"/>
+      <w:r>
+        <w:rPr>
+          <w:rStyle w:val="CommentReference"/>
+          <w:rFonts w:ascii="Palatino Linotype" w:hAnsi="Palatino Linotype"/>
+          <w:sz w:val="20"/>
+          <w:szCs w:val="20"/>
+          <w:lang w:val="pt-BR"/>
+        </w:rPr>
+        <w:commentReference w:id="3"/>
+      </w:r>
+      <w:r>
+        <w:rPr>
+          <w:rFonts w:ascii="Palatino Linotype" w:hAnsi="Palatino Linotype"/>
+          <w:sz w:val="20"/>
+          <w:szCs w:val="20"/>
+          <w:lang w:val="pt-BR"/>
+        </w:rPr>
+        <w:t>?</w:t>
       </w:r>
       <w:r>
         <w:rPr>
@@ -798,6 +883,7 @@
           <w:lang w:val="pt-BR"/>
         </w:rPr>
       </w:pPr>
+      <w:commentRangeStart w:id="4"/>
       <w:r>
         <w:rPr>
           <w:rFonts w:ascii="Palatino Linotype" w:hAnsi="Palatino Linotype"/>
@@ -806,6 +892,17 @@
           <w:lang w:val="pt-BR"/>
         </w:rPr>
         <w:t xml:space="preserve"> no seu país de origem?</w:t>
+      </w:r>
+      <w:commentRangeEnd w:id="4"/>
+      <w:r>
+        <w:rPr>
+          <w:rStyle w:val="CommentReference"/>
+          <w:rFonts w:ascii="Palatino Linotype" w:hAnsi="Palatino Linotype"/>
+          <w:sz w:val="20"/>
+          <w:szCs w:val="20"/>
+          <w:lang w:val="pt-BR"/>
+        </w:rPr>
+        <w:commentReference w:id="4"/>
       </w:r>
     </w:p>
     <w:p>
@@ -901,14 +998,35 @@
           <w:lang w:val="pt-BR"/>
         </w:rPr>
       </w:pPr>
-      <w:r>
-        <w:rPr>
-          <w:rFonts w:ascii="Palatino Linotype" w:hAnsi="Palatino Linotype"/>
-          <w:sz w:val="20"/>
-          <w:szCs w:val="20"/>
-          <w:lang w:val="pt-BR"/>
-        </w:rPr>
-        <w:t>Com que idade você chegou aos Estados Unidos?</w:t>
+      <w:commentRangeStart w:id="5"/>
+      <w:r>
+        <w:rPr>
+          <w:rFonts w:ascii="Palatino Linotype" w:hAnsi="Palatino Linotype"/>
+          <w:sz w:val="20"/>
+          <w:szCs w:val="20"/>
+          <w:lang w:val="pt-BR"/>
+        </w:rPr>
+        <w:t xml:space="preserve">Com </w:t>
+      </w:r>
+      <w:commentRangeEnd w:id="5"/>
+      <w:r>
+        <w:rPr>
+          <w:rStyle w:val="CommentReference"/>
+          <w:rFonts w:ascii="Palatino Linotype" w:hAnsi="Palatino Linotype"/>
+          <w:sz w:val="20"/>
+          <w:szCs w:val="20"/>
+          <w:lang w:val="pt-BR"/>
+        </w:rPr>
+        <w:commentReference w:id="5"/>
+      </w:r>
+      <w:r>
+        <w:rPr>
+          <w:rFonts w:ascii="Palatino Linotype" w:hAnsi="Palatino Linotype"/>
+          <w:sz w:val="20"/>
+          <w:szCs w:val="20"/>
+          <w:lang w:val="pt-BR"/>
+        </w:rPr>
+        <w:t>que idade você chegou aos Estados Unidos?</w:t>
       </w:r>
       <w:r>
         <w:rPr>
@@ -1215,7 +1333,8 @@
           <w:lang w:val="pt-BR"/>
         </w:rPr>
       </w:pPr>
-      <w:commentRangeStart w:id="1"/>
+      <w:commentRangeStart w:id="6"/>
+      <w:commentRangeStart w:id="7"/>
       <w:r>
         <w:rPr>
           <w:rFonts w:ascii="Palatino Linotype" w:hAnsi="Palatino Linotype"/>
@@ -1246,7 +1365,7 @@
         </w:rPr>
         <w:t>nos seguintes contextos?</w:t>
       </w:r>
-      <w:commentRangeEnd w:id="1"/>
+      <w:commentRangeEnd w:id="6"/>
       <w:r>
         <w:rPr>
           <w:rStyle w:val="CommentReference"/>
@@ -1255,7 +1374,18 @@
           <w:szCs w:val="20"/>
           <w:lang w:val="pt-BR"/>
         </w:rPr>
-        <w:commentReference w:id="1"/>
+        <w:commentReference w:id="6"/>
+      </w:r>
+      <w:commentRangeEnd w:id="7"/>
+      <w:r>
+        <w:rPr>
+          <w:rStyle w:val="CommentReference"/>
+          <w:rFonts w:ascii="Palatino Linotype" w:hAnsi="Palatino Linotype"/>
+          <w:sz w:val="20"/>
+          <w:szCs w:val="20"/>
+          <w:lang w:val="pt-BR"/>
+        </w:rPr>
+        <w:commentReference w:id="7"/>
       </w:r>
     </w:p>
     <w:tbl>
@@ -8861,7 +8991,7 @@
           <w:lang w:val="pt-BR"/>
         </w:rPr>
       </w:pPr>
-      <w:commentRangeStart w:id="2"/>
+      <w:commentRangeStart w:id="8"/>
       <w:r>
         <w:rPr>
           <w:rFonts w:ascii="Palatino Linotype" w:hAnsi="Palatino Linotype"/>
@@ -8874,7 +9004,7 @@
         </w:rPr>
         <w:t>C. Identidade</w:t>
       </w:r>
-      <w:commentRangeEnd w:id="2"/>
+      <w:commentRangeEnd w:id="8"/>
       <w:r>
         <w:rPr>
           <w:rStyle w:val="CommentReference"/>
@@ -8886,7 +9016,7 @@
           <w:szCs w:val="20"/>
           <w:lang w:val="pt-BR"/>
         </w:rPr>
-        <w:commentReference w:id="2"/>
+        <w:commentReference w:id="8"/>
       </w:r>
     </w:p>
     <w:p>
@@ -9185,6 +9315,7 @@
           <w:lang w:val="pt-BR"/>
         </w:rPr>
       </w:pPr>
+      <w:commentRangeStart w:id="9"/>
       <w:r>
         <w:rPr>
           <w:rStyle w:val="Strong"/>
@@ -9207,6 +9338,17 @@
           <w:lang w:val="pt-BR"/>
         </w:rPr>
         <w:br/>
+      </w:r>
+      <w:commentRangeEnd w:id="9"/>
+      <w:r>
+        <w:rPr>
+          <w:rStyle w:val="CommentReference"/>
+          <w:rFonts w:ascii="Palatino Linotype" w:hAnsi="Palatino Linotype"/>
+          <w:sz w:val="20"/>
+          <w:szCs w:val="20"/>
+          <w:lang w:val="pt-BR"/>
+        </w:rPr>
+        <w:commentReference w:id="9"/>
       </w:r>
       <w:r>
         <w:rPr>
@@ -9244,8 +9386,11 @@
 
 <file path=word/comments.xml><?xml version="1.0" encoding="utf-8"?>
 <w:comments xmlns:wpc="http://schemas.microsoft.com/office/word/2010/wordprocessingCanvas" xmlns:cx="http://schemas.microsoft.com/office/drawing/2014/chartex" xmlns:cx1="http://schemas.microsoft.com/office/drawing/2015/9/8/chartex" xmlns:cx2="http://schemas.microsoft.com/office/drawing/2015/10/21/chartex" xmlns:cx3="http://schemas.microsoft.com/office/drawing/2016/5/9/chartex" xmlns:cx4="http://schemas.microsoft.com/office/drawing/2016/5/10/chartex" xmlns:cx5="http://schemas.microsoft.com/office/drawing/2016/5/11/chartex" xmlns:cx6="http://schemas.microsoft.com/office/drawing/2016/5/12/chartex" xmlns:cx7="http://schemas.microsoft.com/office/drawing/2016/5/13/chartex" xmlns:cx8="http://schemas.microsoft.com/office/drawing/2016/5/14/chartex" xmlns:mc="http://schemas.openxmlformats.org/markup-compatibility/2006" xmlns:aink="http://schemas.microsoft.com/office/drawing/2016/ink" xmlns:am3d="http://schemas.microsoft.com/office/drawing/2017/model3d" xmlns:o="urn:schemas-microsoft-com:office:office" xmlns:oel="http://schemas.microsoft.com/office/2019/extlst" xmlns:r="http://schemas.openxmlformats.org/officeDocument/2006/relationships" xmlns:m="http://schemas.openxmlformats.org/officeDocument/2006/math" xmlns:v="urn:schemas-microsoft-com:vml" xmlns:wp14="http://schemas.microsoft.com/office/word/2010/wordprocessingDrawing" xmlns:wp="http://schemas.openxmlformats.org/drawingml/2006/wordprocessingDrawing" xmlns:w10="urn:schemas-microsoft-com:office:word" xmlns:w="http://schemas.openxmlformats.org/wordprocessingml/2006/main" xmlns:w14="http://schemas.microsoft.com/office/word/2010/wordml" xmlns:w15="http://schemas.microsoft.com/office/word/2012/wordml" xmlns:w16cex="http://schemas.microsoft.com/office/word/2018/wordml/cex" xmlns:w16cid="http://schemas.microsoft.com/office/word/2016/wordml/cid" xmlns:w16="http://schemas.microsoft.com/office/word/2018/wordml" xmlns:w16du="http://schemas.microsoft.com/office/word/2023/wordml/word16du" xmlns:w16sdtdh="http://schemas.microsoft.com/office/word/2020/wordml/sdtdatahash" xmlns:w16sdtfl="http://schemas.microsoft.com/office/word/2024/wordml/sdtformatlock" xmlns:w16se="http://schemas.microsoft.com/office/word/2015/wordml/symex" xmlns:wpg="http://schemas.microsoft.com/office/word/2010/wordprocessingGroup" xmlns:wpi="http://schemas.microsoft.com/office/word/2010/wordprocessingInk" xmlns:wne="http://schemas.microsoft.com/office/word/2006/wordml" xmlns:wps="http://schemas.microsoft.com/office/word/2010/wordprocessingShape" mc:Ignorable="w14 w15 w16se w16cid w16 w16cex w16sdtdh w16sdtfl w16du wp14">
-  <w:comment w:id="0" w:author="Kendra Dickinson" w:date="2026-06-19T17:01:00Z" w:initials="KD">
+  <w:comment w:id="0" w:author="Robert Esposito" w:date="2026-06-24T21:14:00Z" w:initials="RE">
     <w:p>
+      <w:pPr>
+        <w:pStyle w:val="CommentText"/>
+      </w:pPr>
       <w:r>
         <w:rPr>
           <w:rStyle w:val="CommentReference"/>
@@ -9253,15 +9398,116 @@
         <w:annotationRef/>
       </w:r>
       <w:r>
-        <w:rPr>
-          <w:sz w:val="20"/>
-          <w:szCs w:val="20"/>
-        </w:rPr>
-        <w:t>Section A: These are general demographic questions, adapted from Daniel Erker's Boston Spanish Project and Kendra Dickinson's Spanish in New Jersey.</w:t>
+        <w:t>Reminder to self: ask about putting into qualtrix</w:t>
       </w:r>
     </w:p>
   </w:comment>
-  <w:comment w:id="1" w:author="Kendra Dickinson" w:date="2026-06-19T16:54:00Z" w:initials="KD">
+  <w:comment w:id="1" w:author="Kendra Dickinson" w:date="2026-06-19T17:01:00Z" w:initials="KD">
+    <w:p>
+      <w:r>
+        <w:rPr>
+          <w:rStyle w:val="CommentReference"/>
+        </w:rPr>
+        <w:annotationRef/>
+      </w:r>
+      <w:r>
+        <w:rPr>
+          <w:sz w:val="20"/>
+          <w:szCs w:val="20"/>
+        </w:rPr>
+        <w:t>Section A: These are general demographic questions, adapted from Daniel Erker's Boston Spanish Project and Kendra Dickinson's Spanish in New Jersey.</w:t>
+      </w:r>
+    </w:p>
+  </w:comment>
+  <w:comment w:id="2" w:author="Robert Esposito" w:date="2026-06-24T21:15:00Z" w:initials="RE">
+    <w:p>
+      <w:pPr>
+        <w:pStyle w:val="CommentText"/>
+      </w:pPr>
+      <w:r>
+        <w:rPr>
+          <w:rStyle w:val="CommentReference"/>
+        </w:rPr>
+        <w:annotationRef/>
+      </w:r>
+      <w:r>
+        <w:t>Make this question a drop-down with countries and then have another question where they can specify town/city/state/region/whatever?</w:t>
+      </w:r>
+    </w:p>
+  </w:comment>
+  <w:comment w:id="3" w:author="Robert Esposito" w:date="2026-06-24T21:16:00Z" w:initials="RE">
+    <w:p>
+      <w:pPr>
+        <w:pStyle w:val="CommentText"/>
+      </w:pPr>
+      <w:r>
+        <w:rPr>
+          <w:rStyle w:val="CommentReference"/>
+        </w:rPr>
+        <w:annotationRef/>
+      </w:r>
+      <w:r>
+        <w:t>Maybe separate this four questions:</w:t>
+      </w:r>
+    </w:p>
+    <w:p>
+      <w:pPr>
+        <w:pStyle w:val="CommentText"/>
+      </w:pPr>
+      <w:r>
+        <w:t>Em que pais voce esutdou…</w:t>
+      </w:r>
+    </w:p>
+    <w:p>
+      <w:pPr>
+        <w:pStyle w:val="CommentText"/>
+      </w:pPr>
+      <w:r>
+        <w:t>&gt;primario CHOICES: (USA, PT, BR, etc., NONE.?)</w:t>
+      </w:r>
+    </w:p>
+    <w:p>
+      <w:pPr>
+        <w:pStyle w:val="CommentText"/>
+      </w:pPr>
+      <w:r>
+        <w:t>&gt; secundario etc.</w:t>
+      </w:r>
+    </w:p>
+  </w:comment>
+  <w:comment w:id="4" w:author="Robert Esposito" w:date="2026-06-24T21:16:00Z" w:initials="RE">
+    <w:p>
+      <w:pPr>
+        <w:pStyle w:val="CommentText"/>
+      </w:pPr>
+      <w:r>
+        <w:rPr>
+          <w:rStyle w:val="CommentReference"/>
+        </w:rPr>
+        <w:annotationRef/>
+      </w:r>
+      <w:r>
+        <w:t>Add NA option</w:t>
+      </w:r>
+    </w:p>
+  </w:comment>
+  <w:comment w:id="5" w:author="Robert Esposito" w:date="2026-06-24T21:17:00Z" w:initials="RE">
+    <w:p>
+      <w:pPr>
+        <w:pStyle w:val="CommentText"/>
+      </w:pPr>
+      <w:r>
+        <w:rPr>
+          <w:rStyle w:val="CommentReference"/>
+        </w:rPr>
+        <w:annotationRef/>
+      </w:r>
+      <w:r>
+        <w:t>Make 9-12 drop downs so that they can’t put random stuff.</w:t>
+      </w:r>
+    </w:p>
+  </w:comment>
+  <w:comment w:id="6" w:author="Kendra Dickinson" w:date="2026-06-19T16:54:00Z" w:initials="KD">
     <w:p>
       <w:r>
         <w:rPr>
@@ -9279,7 +9525,68 @@
     </w:p>
     <w:p/>
   </w:comment>
-  <w:comment w:id="2" w:author="Kendra Dickinson" w:date="2026-06-19T17:07:00Z" w:initials="KD">
+  <w:comment w:id="7" w:author="Robert Esposito" w:date="2026-06-24T21:24:00Z" w:initials="RE">
+    <w:p>
+      <w:pPr>
+        <w:pStyle w:val="CommentText"/>
+      </w:pPr>
+      <w:r>
+        <w:rPr>
+          <w:rStyle w:val="CommentReference"/>
+        </w:rPr>
+        <w:annotationRef/>
+      </w:r>
+      <w:r>
+        <w:t>I haven’t used Qulatrix in a while, but I’m assuming we can have one question like the following &amp; they can check off multiple: Do you ever interact with speakers from…</w:t>
+      </w:r>
+    </w:p>
+    <w:p>
+      <w:pPr>
+        <w:pStyle w:val="CommentText"/>
+      </w:pPr>
+      <w:r>
+        <w:t>&gt;Acores</w:t>
+      </w:r>
+    </w:p>
+    <w:p>
+      <w:pPr>
+        <w:pStyle w:val="CommentText"/>
+      </w:pPr>
+      <w:r>
+        <w:t>&gt;Angola</w:t>
+      </w:r>
+    </w:p>
+    <w:p>
+      <w:pPr>
+        <w:pStyle w:val="CommentText"/>
+      </w:pPr>
+      <w:r>
+        <w:t>&gt;Brazil etc</w:t>
+      </w:r>
+    </w:p>
+    <w:p>
+      <w:pPr>
+        <w:pStyle w:val="CommentText"/>
+      </w:pPr>
+      <w:r>
+        <w:t>And then it’ll lead to these boxes for ONLY the ones they checked off.</w:t>
+      </w:r>
+    </w:p>
+    <w:p>
+      <w:pPr>
+        <w:pStyle w:val="CommentText"/>
+      </w:pPr>
+    </w:p>
+    <w:p>
+      <w:pPr>
+        <w:pStyle w:val="CommentText"/>
+      </w:pPr>
+      <w:r>
+        <w:t>After by country, we can hone in on specific regions/dialects from countries that the participant can input? I think 20 gets at that, but it’s still about country instead of regions within a country.</w:t>
+      </w:r>
+    </w:p>
+  </w:comment>
+  <w:comment w:id="8" w:author="Kendra Dickinson" w:date="2026-06-19T17:07:00Z" w:initials="KD">
     <w:p>
       <w:r>
         <w:rPr>
@@ -9367,31 +9674,68 @@
       </w:r>
     </w:p>
     <w:p/>
+  </w:comment>
+  <w:comment w:id="9" w:author="Robert Esposito" w:date="2026-06-24T21:27:00Z" w:initials="RE">
+    <w:p>
+      <w:pPr>
+        <w:pStyle w:val="CommentText"/>
+      </w:pPr>
+      <w:r>
+        <w:rPr>
+          <w:rStyle w:val="CommentReference"/>
+        </w:rPr>
+        <w:annotationRef/>
+      </w:r>
+      <w:r>
+        <w:t>Reminder to myself to ask about this one. Not super convinced by it.</w:t>
+      </w:r>
+    </w:p>
   </w:comment>
 </w:comments>
 </file>
 
 <file path=word/commentsExtended.xml><?xml version="1.0" encoding="utf-8"?>
 <w15:commentsEx xmlns:wpc="http://schemas.microsoft.com/office/word/2010/wordprocessingCanvas" xmlns:cx="http://schemas.microsoft.com/office/drawing/2014/chartex" xmlns:cx1="http://schemas.microsoft.com/office/drawing/2015/9/8/chartex" xmlns:cx2="http://schemas.microsoft.com/office/drawing/2015/10/21/chartex" xmlns:cx3="http://schemas.microsoft.com/office/drawing/2016/5/9/chartex" xmlns:cx4="http://schemas.microsoft.com/office/drawing/2016/5/10/chartex" xmlns:cx5="http://schemas.microsoft.com/office/drawing/2016/5/11/chartex" xmlns:cx6="http://schemas.microsoft.com/office/drawing/2016/5/12/chartex" xmlns:cx7="http://schemas.microsoft.com/office/drawing/2016/5/13/chartex" xmlns:cx8="http://schemas.microsoft.com/office/drawing/2016/5/14/chartex" xmlns:mc="http://schemas.openxmlformats.org/markup-compatibility/2006" xmlns:aink="http://schemas.microsoft.com/office/drawing/2016/ink" xmlns:am3d="http://schemas.microsoft.com/office/drawing/2017/model3d" xmlns:o="urn:schemas-microsoft-com:office:office" xmlns:oel="http://schemas.microsoft.com/office/2019/extlst" xmlns:r="http://schemas.openxmlformats.org/officeDocument/2006/relationships" xmlns:m="http://schemas.openxmlformats.org/officeDocument/2006/math" xmlns:v="urn:schemas-microsoft-com:vml" xmlns:wp14="http://schemas.microsoft.com/office/word/2010/wordprocessingDrawing" xmlns:wp="http://schemas.openxmlformats.org/drawingml/2006/wordprocessingDrawing" xmlns:w10="urn:schemas-microsoft-com:office:word" xmlns:w="http://schemas.openxmlformats.org/wordprocessingml/2006/main" xmlns:w14="http://schemas.microsoft.com/office/word/2010/wordml" xmlns:w15="http://schemas.microsoft.com/office/word/2012/wordml" xmlns:w16cex="http://schemas.microsoft.com/office/word/2018/wordml/cex" xmlns:w16cid="http://schemas.microsoft.com/office/word/2016/wordml/cid" xmlns:w16="http://schemas.microsoft.com/office/word/2018/wordml" xmlns:w16du="http://schemas.microsoft.com/office/word/2023/wordml/word16du" xmlns:w16sdtdh="http://schemas.microsoft.com/office/word/2020/wordml/sdtdatahash" xmlns:w16sdtfl="http://schemas.microsoft.com/office/word/2024/wordml/sdtformatlock" xmlns:w16se="http://schemas.microsoft.com/office/word/2015/wordml/symex" xmlns:wpg="http://schemas.microsoft.com/office/word/2010/wordprocessingGroup" xmlns:wpi="http://schemas.microsoft.com/office/word/2010/wordprocessingInk" xmlns:wne="http://schemas.microsoft.com/office/word/2006/wordml" xmlns:wps="http://schemas.microsoft.com/office/word/2010/wordprocessingShape" mc:Ignorable="w14 w15 w16se w16cid w16 w16cex w16sdtdh w16sdtfl w16du wp14">
+  <w15:commentEx w15:paraId="26A923C2" w15:done="0"/>
   <w15:commentEx w15:paraId="5C698446" w15:done="0"/>
+  <w15:commentEx w15:paraId="115B20CF" w15:done="0"/>
+  <w15:commentEx w15:paraId="0FDA3DAB" w15:done="0"/>
+  <w15:commentEx w15:paraId="5C840356" w15:done="0"/>
+  <w15:commentEx w15:paraId="1A21870E" w15:done="0"/>
   <w15:commentEx w15:paraId="120A6B05" w15:done="0"/>
+  <w15:commentEx w15:paraId="1A8A481D" w15:paraIdParent="120A6B05" w15:done="0"/>
   <w15:commentEx w15:paraId="726E6A84" w15:done="0"/>
+  <w15:commentEx w15:paraId="1AD6CFC8" w15:done="0"/>
 </w15:commentsEx>
 </file>
 
 <file path=word/commentsExtensible.xml><?xml version="1.0" encoding="utf-8"?>
 <w16cex:commentsExtensible xmlns:wpc="http://schemas.microsoft.com/office/word/2010/wordprocessingCanvas" xmlns:cx="http://schemas.microsoft.com/office/drawing/2014/chartex" xmlns:cx1="http://schemas.microsoft.com/office/drawing/2015/9/8/chartex" xmlns:cx2="http://schemas.microsoft.com/office/drawing/2015/10/21/chartex" xmlns:cx3="http://schemas.microsoft.com/office/drawing/2016/5/9/chartex" xmlns:cx4="http://schemas.microsoft.com/office/drawing/2016/5/10/chartex" xmlns:cx5="http://schemas.microsoft.com/office/drawing/2016/5/11/chartex" xmlns:cx6="http://schemas.microsoft.com/office/drawing/2016/5/12/chartex" xmlns:cx7="http://schemas.microsoft.com/office/drawing/2016/5/13/chartex" xmlns:cx8="http://schemas.microsoft.com/office/drawing/2016/5/14/chartex" xmlns:cr="http://schemas.microsoft.com/office/comments/2020/reactions" xmlns:mc="http://schemas.openxmlformats.org/markup-compatibility/2006" xmlns:aink="http://schemas.microsoft.com/office/drawing/2016/ink" xmlns:am3d="http://schemas.microsoft.com/office/drawing/2017/model3d" xmlns:o="urn:schemas-microsoft-com:office:office" xmlns:oel="http://schemas.microsoft.com/office/2019/extlst" xmlns:r="http://schemas.openxmlformats.org/officeDocument/2006/relationships" xmlns:m="http://schemas.openxmlformats.org/officeDocument/2006/math" xmlns:v="urn:schemas-microsoft-com:vml" xmlns:wp14="http://schemas.microsoft.com/office/word/2010/wordprocessingDrawing" xmlns:wp="http://schemas.openxmlformats.org/drawingml/2006/wordprocessingDrawing" xmlns:w10="urn:schemas-microsoft-com:office:word" xmlns:w="http://schemas.openxmlformats.org/wordprocessingml/2006/main" xmlns:w14="http://schemas.microsoft.com/office/word/2010/wordml" xmlns:w15="http://schemas.microsoft.com/office/word/2012/wordml" xmlns:w16cex="http://schemas.microsoft.com/office/word/2018/wordml/cex" xmlns:w16cid="http://schemas.microsoft.com/office/word/2016/wordml/cid" xmlns:w16="http://schemas.microsoft.com/office/word/2018/wordml" xmlns:w16du="http://schemas.microsoft.com/office/word/2023/wordml/word16du" xmlns:w16sdtdh="http://schemas.microsoft.com/office/word/2020/wordml/sdtdatahash" xmlns:w16sdtfl="http://schemas.microsoft.com/office/word/2024/wordml/sdtformatlock" xmlns:w16se="http://schemas.microsoft.com/office/word/2015/wordml/symex" xmlns:wpg="http://schemas.microsoft.com/office/word/2010/wordprocessingGroup" xmlns:wpi="http://schemas.microsoft.com/office/word/2010/wordprocessingInk" xmlns:wne="http://schemas.microsoft.com/office/word/2006/wordml" xmlns:wps="http://schemas.microsoft.com/office/word/2010/wordprocessingShape" mc:Ignorable="w14 w15 w16se w16cid w16 w16cex w16sdtdh w16sdtfl cr w16du wp14">
+  <w16cex:commentExtensible w16cex:durableId="60B81231" w16cex:dateUtc="2026-06-25T01:14:00Z"/>
   <w16cex:commentExtensible w16cex:durableId="3F0259C3" w16cex:dateUtc="2026-06-19T21:01:00Z"/>
+  <w16cex:commentExtensible w16cex:durableId="113855AF" w16cex:dateUtc="2026-06-25T01:15:00Z"/>
+  <w16cex:commentExtensible w16cex:durableId="0FBE4615" w16cex:dateUtc="2026-06-25T01:16:00Z"/>
+  <w16cex:commentExtensible w16cex:durableId="58005648" w16cex:dateUtc="2026-06-25T01:16:00Z"/>
+  <w16cex:commentExtensible w16cex:durableId="7755352B" w16cex:dateUtc="2026-06-25T01:17:00Z"/>
   <w16cex:commentExtensible w16cex:durableId="69FC8AC1" w16cex:dateUtc="2026-06-19T20:54:00Z"/>
+  <w16cex:commentExtensible w16cex:durableId="74980104" w16cex:dateUtc="2026-06-25T01:24:00Z"/>
   <w16cex:commentExtensible w16cex:durableId="0BFCF4D3" w16cex:dateUtc="2026-06-19T21:07:00Z"/>
+  <w16cex:commentExtensible w16cex:durableId="3CDE9690" w16cex:dateUtc="2026-06-25T01:27:00Z"/>
 </w16cex:commentsExtensible>
 </file>
 
 <file path=word/commentsIds.xml><?xml version="1.0" encoding="utf-8"?>
 <w16cid:commentsIds xmlns:wpc="http://schemas.microsoft.com/office/word/2010/wordprocessingCanvas" xmlns:cx="http://schemas.microsoft.com/office/drawing/2014/chartex" xmlns:cx1="http://schemas.microsoft.com/office/drawing/2015/9/8/chartex" xmlns:cx2="http://schemas.microsoft.com/office/drawing/2015/10/21/chartex" xmlns:cx3="http://schemas.microsoft.com/office/drawing/2016/5/9/chartex" xmlns:cx4="http://schemas.microsoft.com/office/drawing/2016/5/10/chartex" xmlns:cx5="http://schemas.microsoft.com/office/drawing/2016/5/11/chartex" xmlns:cx6="http://schemas.microsoft.com/office/drawing/2016/5/12/chartex" xmlns:cx7="http://schemas.microsoft.com/office/drawing/2016/5/13/chartex" xmlns:cx8="http://schemas.microsoft.com/office/drawing/2016/5/14/chartex" xmlns:mc="http://schemas.openxmlformats.org/markup-compatibility/2006" xmlns:aink="http://schemas.microsoft.com/office/drawing/2016/ink" xmlns:am3d="http://schemas.microsoft.com/office/drawing/2017/model3d" xmlns:o="urn:schemas-microsoft-com:office:office" xmlns:oel="http://schemas.microsoft.com/office/2019/extlst" xmlns:r="http://schemas.openxmlformats.org/officeDocument/2006/relationships" xmlns:m="http://schemas.openxmlformats.org/officeDocument/2006/math" xmlns:v="urn:schemas-microsoft-com:vml" xmlns:wp14="http://schemas.microsoft.com/office/word/2010/wordprocessingDrawing" xmlns:wp="http://schemas.openxmlformats.org/drawingml/2006/wordprocessingDrawing" xmlns:w10="urn:schemas-microsoft-com:office:word" xmlns:w="http://schemas.openxmlformats.org/wordprocessingml/2006/main" xmlns:w14="http://schemas.microsoft.com/office/word/2010/wordml" xmlns:w15="http://schemas.microsoft.com/office/word/2012/wordml" xmlns:w16cex="http://schemas.microsoft.com/office/word/2018/wordml/cex" xmlns:w16cid="http://schemas.microsoft.com/office/word/2016/wordml/cid" xmlns:w16="http://schemas.microsoft.com/office/word/2018/wordml" xmlns:w16du="http://schemas.microsoft.com/office/word/2023/wordml/word16du" xmlns:w16sdtdh="http://schemas.microsoft.com/office/word/2020/wordml/sdtdatahash" xmlns:w16sdtfl="http://schemas.microsoft.com/office/word/2024/wordml/sdtformatlock" xmlns:w16se="http://schemas.microsoft.com/office/word/2015/wordml/symex" xmlns:wpg="http://schemas.microsoft.com/office/word/2010/wordprocessingGroup" xmlns:wpi="http://schemas.microsoft.com/office/word/2010/wordprocessingInk" xmlns:wne="http://schemas.microsoft.com/office/word/2006/wordml" xmlns:wps="http://schemas.microsoft.com/office/word/2010/wordprocessingShape" mc:Ignorable="w14 w15 w16se w16cid w16 w16cex w16sdtdh w16sdtfl w16du wp14">
+  <w16cid:commentId w16cid:paraId="26A923C2" w16cid:durableId="60B81231"/>
   <w16cid:commentId w16cid:paraId="5C698446" w16cid:durableId="3F0259C3"/>
+  <w16cid:commentId w16cid:paraId="115B20CF" w16cid:durableId="113855AF"/>
+  <w16cid:commentId w16cid:paraId="0FDA3DAB" w16cid:durableId="0FBE4615"/>
+  <w16cid:commentId w16cid:paraId="5C840356" w16cid:durableId="58005648"/>
+  <w16cid:commentId w16cid:paraId="1A21870E" w16cid:durableId="7755352B"/>
   <w16cid:commentId w16cid:paraId="120A6B05" w16cid:durableId="69FC8AC1"/>
+  <w16cid:commentId w16cid:paraId="1A8A481D" w16cid:durableId="74980104"/>
   <w16cid:commentId w16cid:paraId="726E6A84" w16cid:durableId="0BFCF4D3"/>
+  <w16cid:commentId w16cid:paraId="1AD6CFC8" w16cid:durableId="3CDE9690"/>
 </w16cid:commentsIds>
 </file>
 
@@ -9547,7 +9891,7 @@
               <v:stroke joinstyle="miter"/>
               <v:path gradientshapeok="t" o:connecttype="rect"/>
             </v:shapetype>
-            <v:shape id="Text Box 1" o:spid="_x0000_s1026" type="#_x0000_t202" style="position:absolute;margin-left:516.95pt;margin-top:.05pt;width:12.45pt;height:11.45pt;z-index:251657728;visibility:visible;mso-wrap-style:square;mso-width-percent:0;mso-height-percent:0;mso-wrap-distance-left:0;mso-wrap-distance-top:0;mso-wrap-distance-right:0;mso-wrap-distance-bottom:0;mso-position-horizontal:absolute;mso-position-horizontal-relative:page;mso-position-vertical:absolute;mso-position-vertical-relative:text;mso-width-percent:0;mso-height-percent:0;mso-width-relative:page;mso-height-relative:page;v-text-anchor:top" o:gfxdata="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" stroked="f">
+            <v:shape id="Text Box 1" o:spid="_x0000_s1026" type="#_x0000_t202" style="position:absolute;margin-left:516.95pt;margin-top:.05pt;width:12.45pt;height:11.45pt;z-index:251657728;visibility:visible;mso-wrap-style:square;mso-width-percent:0;mso-height-percent:0;mso-wrap-distance-left:0;mso-wrap-distance-top:0;mso-wrap-distance-right:0;mso-wrap-distance-bottom:0;mso-position-horizontal:absolute;mso-position-horizontal-relative:page;mso-position-vertical:absolute;mso-position-vertical-relative:text;mso-width-percent:0;mso-height-percent:0;mso-width-relative:page;mso-height-relative:page;v-text-anchor:top" o:gfxdata="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" stroked="f">
               <v:fill opacity="0"/>
               <v:path arrowok="t"/>
               <v:textbox inset="0,0,0,0">
@@ -10405,6 +10749,9 @@
 
 <file path=word/people.xml><?xml version="1.0" encoding="utf-8"?>
 <w15:people xmlns:wpc="http://schemas.microsoft.com/office/word/2010/wordprocessingCanvas" xmlns:cx="http://schemas.microsoft.com/office/drawing/2014/chartex" xmlns:cx1="http://schemas.microsoft.com/office/drawing/2015/9/8/chartex" xmlns:cx2="http://schemas.microsoft.com/office/drawing/2015/10/21/chartex" xmlns:cx3="http://schemas.microsoft.com/office/drawing/2016/5/9/chartex" xmlns:cx4="http://schemas.microsoft.com/office/drawing/2016/5/10/chartex" xmlns:cx5="http://schemas.microsoft.com/office/drawing/2016/5/11/chartex" xmlns:cx6="http://schemas.microsoft.com/office/drawing/2016/5/12/chartex" xmlns:cx7="http://schemas.microsoft.com/office/drawing/2016/5/13/chartex" xmlns:cx8="http://schemas.microsoft.com/office/drawing/2016/5/14/chartex" xmlns:mc="http://schemas.openxmlformats.org/markup-compatibility/2006" xmlns:aink="http://schemas.microsoft.com/office/drawing/2016/ink" xmlns:am3d="http://schemas.microsoft.com/office/drawing/2017/model3d" xmlns:o="urn:schemas-microsoft-com:office:office" xmlns:oel="http://schemas.microsoft.com/office/2019/extlst" xmlns:r="http://schemas.openxmlformats.org/officeDocument/2006/relationships" xmlns:m="http://schemas.openxmlformats.org/officeDocument/2006/math" xmlns:v="urn:schemas-microsoft-com:vml" xmlns:wp14="http://schemas.microsoft.com/office/word/2010/wordprocessingDrawing" xmlns:wp="http://schemas.openxmlformats.org/drawingml/2006/wordprocessingDrawing" xmlns:w10="urn:schemas-microsoft-com:office:word" xmlns:w="http://schemas.openxmlformats.org/wordprocessingml/2006/main" xmlns:w14="http://schemas.microsoft.com/office/word/2010/wordml" xmlns:w15="http://schemas.microsoft.com/office/word/2012/wordml" xmlns:w16cex="http://schemas.microsoft.com/office/word/2018/wordml/cex" xmlns:w16cid="http://schemas.microsoft.com/office/word/2016/wordml/cid" xmlns:w16="http://schemas.microsoft.com/office/word/2018/wordml" xmlns:w16du="http://schemas.microsoft.com/office/word/2023/wordml/word16du" xmlns:w16sdtdh="http://schemas.microsoft.com/office/word/2020/wordml/sdtdatahash" xmlns:w16sdtfl="http://schemas.microsoft.com/office/word/2024/wordml/sdtformatlock" xmlns:w16se="http://schemas.microsoft.com/office/word/2015/wordml/symex" xmlns:wpg="http://schemas.microsoft.com/office/word/2010/wordprocessingGroup" xmlns:wpi="http://schemas.microsoft.com/office/word/2010/wordprocessingInk" xmlns:wne="http://schemas.microsoft.com/office/word/2006/wordml" xmlns:wps="http://schemas.microsoft.com/office/word/2010/wordprocessingShape" mc:Ignorable="w14 w15 w16se w16cid w16 w16cex w16sdtdh w16sdtfl w16du wp14">
+  <w15:person w15:author="Robert Esposito">
+    <w15:presenceInfo w15:providerId="AD" w15:userId="S::rme70@spanport.rutgers.edu::619e3713-704e-4767-bc53-c5189c341c39"/>
+  </w15:person>
   <w15:person w15:author="Kendra Dickinson">
     <w15:presenceInfo w15:providerId="AD" w15:userId="S::kd866@spanport.rutgers.edu::453a5979-f629-47c6-b178-c7feeb10dddc"/>
   </w15:person>
@@ -11731,7 +12078,6 @@
     <w:basedOn w:val="Normal"/>
     <w:link w:val="CommentTextChar"/>
     <w:uiPriority w:val="99"/>
-    <w:semiHidden/>
     <w:unhideWhenUsed/>
     <w:rsid w:val="000B781D"/>
     <w:rPr>
@@ -11744,7 +12090,6 @@
     <w:basedOn w:val="DefaultParagraphFont"/>
     <w:link w:val="CommentText"/>
     <w:uiPriority w:val="99"/>
-    <w:semiHidden/>
     <w:rsid w:val="000B781D"/>
   </w:style>
   <w:style w:type="paragraph" w:styleId="CommentSubject">

</xml_diff>